<commit_message>
feat: implement core MTUFace application structure and authentication UI
</commit_message>
<xml_diff>
--- a/docs/MTUFace_BaoCao_HoanThien.docx
+++ b/docs/MTUFace_BaoCao_HoanThien.docx
@@ -311,10 +311,7 @@
         <w:jc w:val="both"/>
       </w:pPr>
       <w:r>
-        <w:t>Trong suốt quá trình học tập và đặc biệt là khi thực hiện đồ án tốt nghiệp này, em đã nhận được rất nhiều sự giúp đỡ, động viên và chỉ dẫn quý báu từ các thầy cô, bạn bè và người thân. Nhân dịp hoàn thành bài báo cáo, em xin được bày tỏ lòng biết ơn chân t</w:t>
-      </w:r>
-      <w:r>
-        <w:t>hành và sâu sắc đến tất cả những người đã đồng hành cùng em trong suốt chặng đường vừa qua.</w:t>
+        <w:t>Trong suốt quá trình học tập và đặc biệt là khi thực hiện đồ án tốt nghiệp này, em đã nhận được rất nhiều sự giúp đỡ, động viên và chỉ dẫn quý báu từ các thầy cô, bạn bè và người thân. Nhân dịp hoàn thành bài báo cáo, em xin được bày tỏ lòng biết ơn chân thành và sâu sắc đến tất cả những người đã đồng hành cùng em trong suốt chặng đường vừa qua.</w:t>
       </w:r>
     </w:p>
     <w:p>
@@ -324,10 +321,7 @@
         <w:jc w:val="both"/>
       </w:pPr>
       <w:r>
-        <w:t>Trước hết, em xin kính gửi lời cảm ơn đến Ban Giám hiệu cùng tập thể quý Thầy Cô Trường Đại Học Xây Dựng Miền Tây, đặc biệt là quý Thầy Cô Khoa Công Nghệ, đã tận tì</w:t>
-      </w:r>
-      <w:r>
-        <w:t>nh giảng dạy, truyền đạt kiến thức và tạo điều kiện thuận lợi để em có thể tiếp thu tri thức chuyên môn trong suốt quá trình học tập tại trường.</w:t>
+        <w:t>Trước hết, em xin kính gửi lời cảm ơn đến Ban Giám hiệu cùng tập thể quý Thầy Cô Trường Đại Học Xây Dựng Miền Tây, đặc biệt là quý Thầy Cô Khoa Công Nghệ, đã tận tình giảng dạy, truyền đạt kiến thức và tạo điều kiện thuận lợi để em có thể tiếp thu tri thức chuyên môn trong suốt quá trình học tập tại trường.</w:t>
       </w:r>
     </w:p>
     <w:p>
@@ -337,10 +331,7 @@
         <w:jc w:val="both"/>
       </w:pPr>
       <w:r>
-        <w:t>Đặc biệt, em xin trân trọng cảm ơn Cô Đặng Thị Xuân Tiên và Thầy Hà Hoài Nam – những người đã trực tiếp hướng d</w:t>
-      </w:r>
-      <w:r>
-        <w:t>ẫn em thực hiện đồ án tốt nghiệp này. Quý Thầy Cô không chỉ tận tâm trong việc góp ý chỉnh sửa nội dung chuyên môn, định hướng tư duy khoa học, mà còn luôn kiên nhẫn hỗ trợ em vượt qua những khó khăn trong quá trình nghiên cứu và xây dựng hệ thống.</w:t>
+        <w:t>Đặc biệt, em xin trân trọng cảm ơn Cô Đặng Thị Xuân Tiên và Thầy Hà Hoài Nam – những người đã trực tiếp hướng dẫn em thực hiện đồ án tốt nghiệp này. Quý Thầy Cô không chỉ tận tâm trong việc góp ý chỉnh sửa nội dung chuyên môn, định hướng tư duy khoa học, mà còn luôn kiên nhẫn hỗ trợ em vượt qua những khó khăn trong quá trình nghiên cứu và xây dựng hệ thống.</w:t>
       </w:r>
     </w:p>
     <w:p>
@@ -350,13 +341,7 @@
         <w:jc w:val="both"/>
       </w:pPr>
       <w:r>
-        <w:t xml:space="preserve">Mặc dù </w:t>
-      </w:r>
-      <w:r>
-        <w:t>đã cố gắng hết sức trong quá trình nghiên cứu và thực hiện đề tài, tuy nhiên với kiến thức và kinh nghiệm thực tế còn hạn chế, bài báo cáo chắc chắn vẫn còn tồn tại những thiếu sót nhất định. Em kính mong nhận được sự góp ý chân thành từ quý Thầy Cô và các</w:t>
-      </w:r>
-      <w:r>
-        <w:t xml:space="preserve"> bạn để em có thể hoàn thiện hơn trong những nghiên cứu sau này.</w:t>
+        <w:t>Mặc dù đã cố gắng hết sức trong quá trình nghiên cứu và thực hiện đề tài, tuy nhiên với kiến thức và kinh nghiệm thực tế còn hạn chế, bài báo cáo chắc chắn vẫn còn tồn tại những thiếu sót nhất định. Em kính mong nhận được sự góp ý chân thành từ quý Thầy Cô và các bạn để em có thể hoàn thiện hơn trong những nghiên cứu sau này.</w:t>
       </w:r>
     </w:p>
     <w:p>
@@ -2640,14 +2625,7 @@
                 <w:sz w:val="22"/>
                 <w:szCs w:val="22"/>
               </w:rPr>
-              <w:t>Địa chỉ tài nguyên trên In</w:t>
-            </w:r>
-            <w:r>
-              <w:rPr>
-                <w:sz w:val="22"/>
-                <w:szCs w:val="22"/>
-              </w:rPr>
-              <w:t>ternet</w:t>
+              <w:t>Địa chỉ tài nguyên trên Internet</w:t>
             </w:r>
           </w:p>
         </w:tc>
@@ -2849,10 +2827,7 @@
         <w:jc w:val="both"/>
       </w:pPr>
       <w:r>
-        <w:t>Trong bối cảnh chuyển đổi số đang diễn ra mạnh mẽ tại các cơ sở giáo dục đại học Việt Nam, việc ứng dụng công nghệ trí tuệ nhân tạo (AI) vào quản lý đào tạo ngày càng trở nên cấp thiết. Phương thức điểm danh thủ công truyền thống không chỉ tiêu tốn thời gi</w:t>
-      </w:r>
-      <w:r>
-        <w:t>an giảng dạy mà còn tiềm ẩn nhiều nguy cơ gian lận, đặc biệt là tình trạng sinh viên điểm danh hộ nhau – một vấn đề nan giải chưa có giải pháp triệt để.</w:t>
+        <w:t>Trong bối cảnh chuyển đổi số đang diễn ra mạnh mẽ tại các cơ sở giáo dục đại học Việt Nam, việc ứng dụng công nghệ trí tuệ nhân tạo (AI) vào quản lý đào tạo ngày càng trở nên cấp thiết. Phương thức điểm danh thủ công truyền thống không chỉ tiêu tốn thời gian giảng dạy mà còn tiềm ẩn nhiều nguy cơ gian lận, đặc biệt là tình trạng sinh viên điểm danh hộ nhau – một vấn đề nan giải chưa có giải pháp triệt để.</w:t>
       </w:r>
     </w:p>
     <w:p>
@@ -2862,10 +2837,7 @@
         <w:jc w:val="both"/>
       </w:pPr>
       <w:r>
-        <w:t xml:space="preserve">Nhận thấy thực trạng đó, đề tài "MTUFace – Nghiên cứu giải pháp điểm danh tự động bằng thị giác máy tính" được thực hiện nhằm ứng dụng các công nghệ AI tiên tiến như nhận diện khuôn mặt (Face Recognition), phát hiện giả mạo (Liveness Detection) và trí tuệ </w:t>
-      </w:r>
-      <w:r>
-        <w:t>nhân tạo tạo sinh (Generative AI) vào hệ thống điểm danh thực tế tại Trường Đại học Xây dựng Miền Tây.</w:t>
+        <w:t>Nhận thấy thực trạng đó, đề tài "MTUFace – Nghiên cứu giải pháp điểm danh tự động bằng thị giác máy tính" được thực hiện nhằm ứng dụng các công nghệ AI tiên tiến như nhận diện khuôn mặt (Face Recognition), phát hiện giả mạo (Liveness Detection) và trí tuệ nhân tạo tạo sinh (Generative AI) vào hệ thống điểm danh thực tế tại Trường Đại học Xây dựng Miền Tây.</w:t>
       </w:r>
     </w:p>
     <w:p>
@@ -2875,13 +2847,7 @@
         <w:jc w:val="both"/>
       </w:pPr>
       <w:r>
-        <w:t xml:space="preserve">Hệ thống MTUFace không chỉ dừng lại ở việc nhận diện khuôn mặt đơn thuần mà được xây dựng thành một nền tảng quản lý đào tạo tích hợp đa thành phần, bao </w:t>
-      </w:r>
-      <w:r>
-        <w:t xml:space="preserve">gồm: giao diện web quản trị với thiết kế Glassmorphism hiện đại, ứng dụng di động đa nền tảng cho sinh viên phát triển bằng Flutter, màn hình Kiosk điểm danh tự phục vụ, hệ thống cảnh báo gian lận qua Telegram và trợ lý AI hỏi đáp thông minh dựa trên kiến </w:t>
-      </w:r>
-      <w:r>
-        <w:t>trúc RAG (Retrieval-Augmented Generation).</w:t>
+        <w:t>Hệ thống MTUFace không chỉ dừng lại ở việc nhận diện khuôn mặt đơn thuần mà được xây dựng thành một nền tảng quản lý đào tạo tích hợp đa thành phần, bao gồm: giao diện web quản trị với thiết kế Glassmorphism hiện đại, ứng dụng di động đa nền tảng cho sinh viên phát triển bằng Flutter, màn hình Kiosk điểm danh tự phục vụ, hệ thống cảnh báo gian lận qua Telegram và trợ lý AI hỏi đáp thông minh dựa trên kiến trúc RAG (Retrieval-Augmented Generation).</w:t>
       </w:r>
     </w:p>
     <w:p>
@@ -2899,10 +2865,7 @@
         <w:jc w:val="both"/>
       </w:pPr>
       <w:r>
-        <w:t xml:space="preserve">Bài toán nhận diện khuôn mặt và điểm danh tự động đã được nghiên cứu rộng rãi trong và ngoài nước. Năm 2016, He và cộng sự giới thiệu kiến trúc ResNet (Deep Residual Learning for Image Recognition) giúp huấn luyện mạng nơ-ron rất sâu hiệu quả hơn, tạo nền </w:t>
-      </w:r>
-      <w:r>
-        <w:t>tảng cho hầu hết các mô hình nhận diện khuôn mặt hiện đại. Cùng năm đó, Redmon và cộng sự công bố thuật toán YOLO (You Only Look Once), cách mạng hóa bài toán phát hiện đối tượng thời gian thực.</w:t>
+        <w:t>Bài toán nhận diện khuôn mặt và điểm danh tự động đã được nghiên cứu rộng rãi trong và ngoài nước. Năm 2016, He và cộng sự giới thiệu kiến trúc ResNet (Deep Residual Learning for Image Recognition) giúp huấn luyện mạng nơ-ron rất sâu hiệu quả hơn, tạo nền tảng cho hầu hết các mô hình nhận diện khuôn mặt hiện đại. Cùng năm đó, Redmon và cộng sự công bố thuật toán YOLO (You Only Look Once), cách mạng hóa bài toán phát hiện đối tượng thời gian thực.</w:t>
       </w:r>
     </w:p>
     <w:p>
@@ -2912,13 +2875,7 @@
         <w:jc w:val="both"/>
       </w:pPr>
       <w:r>
-        <w:t>Năm 2019, Deng và cộng sự công bố ArcFace (Additive Angular M</w:t>
-      </w:r>
-      <w:r>
-        <w:t>argin Loss for Deep Face Recognition) tại hội nghị CVPR, đạt kết quả hàng đầu trên các tập dữ liệu benchmark như LFW, MegaFace và IJB-C. ArcFace trở thành nền tảng của thư viện InsightFace – engine nhận diện khuôn mặt mã nguồn mở được sử dụng rộng rãi nhất</w:t>
-      </w:r>
-      <w:r>
-        <w:t xml:space="preserve"> hiện nay.</w:t>
+        <w:t>Năm 2019, Deng và cộng sự công bố ArcFace (Additive Angular Margin Loss for Deep Face Recognition) tại hội nghị CVPR, đạt kết quả hàng đầu trên các tập dữ liệu benchmark như LFW, MegaFace và IJB-C. ArcFace trở thành nền tảng của thư viện InsightFace – engine nhận diện khuôn mặt mã nguồn mở được sử dụng rộng rãi nhất hiện nay.</w:t>
       </w:r>
     </w:p>
     <w:p>
@@ -2928,10 +2885,7 @@
         <w:jc w:val="both"/>
       </w:pPr>
       <w:r>
-        <w:t>Trong nước, nhiều đề tài nghiên cứu về điểm danh sinh viên bằng nhận diện khuôn mặt đã được thực hiện, tuy nhiên hầu hết còn hạn chế ở quy mô nhỏ, thiếu tính năng chống giả mạo và không có ứng dụng di động tích hợp. Đề tài MTUFace được thực hiện</w:t>
-      </w:r>
-      <w:r>
-        <w:t xml:space="preserve"> nhằm khắc phục những hạn chế đó, xây dựng hệ thống hoàn chỉnh, triển khai thực tế tại trường đại học.</w:t>
+        <w:t>Trong nước, nhiều đề tài nghiên cứu về điểm danh sinh viên bằng nhận diện khuôn mặt đã được thực hiện, tuy nhiên hầu hết còn hạn chế ở quy mô nhỏ, thiếu tính năng chống giả mạo và không có ứng dụng di động tích hợp. Đề tài MTUFace được thực hiện nhằm khắc phục những hạn chế đó, xây dựng hệ thống hoàn chỉnh, triển khai thực tế tại trường đại học.</w:t>
       </w:r>
     </w:p>
     <w:p>
@@ -2941,10 +2895,7 @@
         <w:jc w:val="both"/>
       </w:pPr>
       <w:r>
-        <w:t>Năm 2020, Lewis và cộng sự công bố kiến trúc RAG (Retrieval-Augmented Generation) tại NeurIPS, mở ra hướng xây dựng chatbot thông minh có khả năng truy x</w:t>
-      </w:r>
-      <w:r>
-        <w:t>uất kiến thức từ cơ sở dữ liệu riêng mà không bị ảo giác (hallucination) – công nghệ được tích hợp vào trợ lý AI của hệ thống MTUFace.</w:t>
+        <w:t>Năm 2020, Lewis và cộng sự công bố kiến trúc RAG (Retrieval-Augmented Generation) tại NeurIPS, mở ra hướng xây dựng chatbot thông minh có khả năng truy xuất kiến thức từ cơ sở dữ liệu riêng mà không bị ảo giác (hallucination) – công nghệ được tích hợp vào trợ lý AI của hệ thống MTUFace.</w:t>
       </w:r>
     </w:p>
     <w:p>
@@ -2975,10 +2926,7 @@
         <w:spacing w:before="80" w:after="80"/>
       </w:pPr>
       <w:r>
-        <w:t>Xây dựng hệ thống điểm danh tự động bằng nhận diện khuôn</w:t>
-      </w:r>
-      <w:r>
-        <w:t xml:space="preserve"> mặt với độ chính xác cao (&gt;95%), tốc độ xử lý thời gian thực (&lt;2 giây/lượt) và khả năng chống giả mạo hiệu quả.</w:t>
+        <w:t>Xây dựng hệ thống điểm danh tự động bằng nhận diện khuôn mặt với độ chính xác cao (&gt;95%), tốc độ xử lý thời gian thực (&lt;2 giây/lượt) và khả năng chống giả mạo hiệu quả.</w:t>
       </w:r>
     </w:p>
     <w:p>
@@ -2992,10 +2940,7 @@
       </w:pPr>
       <w:r>
         <w:lastRenderedPageBreak/>
-        <w:t xml:space="preserve">Phát triển ứng dụng di động đa nền tảng (iOS/Android) bằng Flutter để sinh viên có thể tra cứu lịch học, lịch sử điểm danh và tương tác với hệ </w:t>
-      </w:r>
-      <w:r>
-        <w:t>thống mọi lúc mọi nơi.</w:t>
+        <w:t>Phát triển ứng dụng di động đa nền tảng (iOS/Android) bằng Flutter để sinh viên có thể tra cứu lịch học, lịch sử điểm danh và tương tác với hệ thống mọi lúc mọi nơi.</w:t>
       </w:r>
     </w:p>
     <w:p>
@@ -3021,10 +2966,7 @@
         <w:spacing w:before="80" w:after="80"/>
       </w:pPr>
       <w:r>
-        <w:t>Xây dựng hệ thống cảnh báo gian lận tự động qua Telegram Bot, thông</w:t>
-      </w:r>
-      <w:r>
-        <w:t xml:space="preserve"> báo ngay lập tức đến giảng viên khi phát hiện hành vi điểm danh bất thường.</w:t>
+        <w:t>Xây dựng hệ thống cảnh báo gian lận tự động qua Telegram Bot, thông báo ngay lập tức đến giảng viên khi phát hiện hành vi điểm danh bất thường.</w:t>
       </w:r>
     </w:p>
     <w:p>
@@ -3055,10 +2997,7 @@
         <w:jc w:val="both"/>
       </w:pPr>
       <w:r>
-        <w:t>Đ</w:t>
-      </w:r>
-      <w:r>
-        <w:t>ề tài sử dụng kết hợp các phương pháp nghiên cứu sau:</w:t>
+        <w:t>Đề tài sử dụng kết hợp các phương pháp nghiên cứu sau:</w:t>
       </w:r>
     </w:p>
     <w:p>
@@ -3084,10 +3023,7 @@
         <w:spacing w:before="80" w:after="80"/>
       </w:pPr>
       <w:r>
-        <w:t>Phương pháp thực nghiệm: Xây dựng hệ thốn</w:t>
-      </w:r>
-      <w:r>
-        <w:t>g, thu thập dữ liệu khuôn mặt sinh viên thực tế, thực nghiệm và đánh giá hiệu năng hệ thống trong môi trường triển khai thực tế.</w:t>
+        <w:t>Phương pháp thực nghiệm: Xây dựng hệ thống, thu thập dữ liệu khuôn mặt sinh viên thực tế, thực nghiệm và đánh giá hiệu năng hệ thống trong môi trường triển khai thực tế.</w:t>
       </w:r>
     </w:p>
     <w:p>
@@ -3100,10 +3036,7 @@
         <w:spacing w:before="80" w:after="80"/>
       </w:pPr>
       <w:r>
-        <w:t>Phương pháp so sánh đánh giá: So sánh hiệu năng giữa các thuật toán AI, đánh giá độ chính xác, tốc độ xử lý và hiệu quả chống g</w:t>
-      </w:r>
-      <w:r>
-        <w:t>iả mạo.</w:t>
+        <w:t>Phương pháp so sánh đánh giá: So sánh hiệu năng giữa các thuật toán AI, đánh giá độ chính xác, tốc độ xử lý và hiệu quả chống giả mạo.</w:t>
       </w:r>
     </w:p>
     <w:p>
@@ -3147,10 +3080,7 @@
         <w:spacing w:before="80" w:after="80"/>
       </w:pPr>
       <w:r>
-        <w:t>Phạm vi công nghệ: Sử dụng Python (backend AI)</w:t>
-      </w:r>
-      <w:r>
-        <w:t>, Flutter/Dart (mobile app), Flask + SocketIO (web server), MySQL + ChromaDB (cơ sở dữ liệu), InsightFace và YOLO+ResNet50 (AI engine).</w:t>
+        <w:t>Phạm vi công nghệ: Sử dụng Python (backend AI), Flutter/Dart (mobile app), Flask + SocketIO (web server), MySQL + ChromaDB (cơ sở dữ liệu), InsightFace và YOLO+ResNet50 (AI engine).</w:t>
       </w:r>
     </w:p>
     <w:p>
@@ -3163,10 +3093,7 @@
         <w:spacing w:before="80" w:after="80"/>
       </w:pPr>
       <w:r>
-        <w:t xml:space="preserve">Phạm vi triển khai: Môi trường học tập tại Trường Đại học Xây dựng Miền Tây, Vĩnh Long; dữ liệu khuôn mặt được thu thập </w:t>
-      </w:r>
-      <w:r>
-        <w:t>từ sinh viên tình nguyện tham gia thực nghiệm.</w:t>
+        <w:t>Phạm vi triển khai: Môi trường học tập tại Trường Đại học Xây dựng Miền Tây, Vĩnh Long; dữ liệu khuôn mặt được thu thập từ sinh viên tình nguyện tham gia thực nghiệm.</w:t>
       </w:r>
     </w:p>
     <w:p>
@@ -3187,10 +3114,7 @@
         <w:pStyle w:val="u2"/>
       </w:pPr>
       <w:r>
-        <w:t xml:space="preserve">6. THÀNH QUẢ ĐẠT ĐƯỢC VÀ Ý </w:t>
-      </w:r>
-      <w:r>
-        <w:t>NGHĨA ĐỀ TÀI</w:t>
+        <w:t>6. THÀNH QUẢ ĐẠT ĐƯỢC VÀ Ý NGHĨA ĐỀ TÀI</w:t>
       </w:r>
     </w:p>
     <w:p>
@@ -3200,10 +3124,7 @@
         <w:jc w:val="both"/>
       </w:pPr>
       <w:r>
-        <w:t>Sau quá trình nghiên cứu và triển khai, đề tài đạt được các thành quả chính: hệ thống web quản trị hoàn chỉnh với giao diện Glassmorphism hiện đại, màn hình Kiosk điểm danh tự phục vụ hoạt động ổn định, ứng dụng di động Flutter hỗ trợ Offline-</w:t>
-      </w:r>
-      <w:r>
-        <w:t>first, pipeline nhận diện khuôn mặt với hai engine AI có thể chuyển đổi linh hoạt, hệ thống Liveness Detection chống giả mạo và trợ lý AI RAG tích hợp ChromaDB.</w:t>
+        <w:t>Sau quá trình nghiên cứu và triển khai, đề tài đạt được các thành quả chính: hệ thống web quản trị hoàn chỉnh với giao diện Glassmorphism hiện đại, màn hình Kiosk điểm danh tự phục vụ hoạt động ổn định, ứng dụng di động Flutter hỗ trợ Offline-first, pipeline nhận diện khuôn mặt với hai engine AI có thể chuyển đổi linh hoạt, hệ thống Liveness Detection chống giả mạo và trợ lý AI RAG tích hợp ChromaDB.</w:t>
       </w:r>
     </w:p>
     <w:p>
@@ -3213,13 +3134,7 @@
         <w:jc w:val="both"/>
       </w:pPr>
       <w:r>
-        <w:t>Về ý nghĩa thực tiễn, hệ thống MTUFace có thể rút ngắn thời gian điểm danh từ 5–10 phút xuống c</w:t>
-      </w:r>
-      <w:r>
-        <w:t>òn 30–60 giây cho một lớp học, đồng thời ngăn chặn hiệu quả tình trạng điểm danh hộ – góp phần nâng cao chất lượng và tính minh bạch trong quản lý đào tạo. Về ý nghĩa khoa học, đề tài đóng góp vào hướng nghiên cứu ứng dụng AI đa mô hình trong giáo dục, kết</w:t>
-      </w:r>
-      <w:r>
-        <w:t xml:space="preserve"> hợp nhiều công nghệ hiện đại trong một hệ thống tích hợp hoàn chỉnh.</w:t>
+        <w:t>Về ý nghĩa thực tiễn, hệ thống MTUFace có thể rút ngắn thời gian điểm danh từ 5–10 phút xuống còn 30–60 giây cho một lớp học, đồng thời ngăn chặn hiệu quả tình trạng điểm danh hộ – góp phần nâng cao chất lượng và tính minh bạch trong quản lý đào tạo. Về ý nghĩa khoa học, đề tài đóng góp vào hướng nghiên cứu ứng dụng AI đa mô hình trong giáo dục, kết hợp nhiều công nghệ hiện đại trong một hệ thống tích hợp hoàn chỉnh.</w:t>
       </w:r>
     </w:p>
     <w:p>
@@ -3259,10 +3174,7 @@
         <w:jc w:val="both"/>
       </w:pPr>
       <w:r>
-        <w:t>Thị giác máy tính (Computer Vision) là một lĩnh vực của trí tuệ nhân tạo nghiên cứu cách máy tính có thể hiểu và diễn giải các thông tin thị giác từ thế giới thực như hình ảnh và video. Mục tiêu của thị giác máy tính là trang bị cho máy tính khả năng "nhìn</w:t>
-      </w:r>
-      <w:r>
-        <w:t>" và "hiểu" như con người – nhận diện đối tượng, phân tích cảnh quan, theo dõi chuyển động và trích xuất thông tin có ý nghĩa từ dữ liệu hình ảnh.</w:t>
+        <w:t>Thị giác máy tính (Computer Vision) là một lĩnh vực của trí tuệ nhân tạo nghiên cứu cách máy tính có thể hiểu và diễn giải các thông tin thị giác từ thế giới thực như hình ảnh và video. Mục tiêu của thị giác máy tính là trang bị cho máy tính khả năng "nhìn" và "hiểu" như con người – nhận diện đối tượng, phân tích cảnh quan, theo dõi chuyển động và trích xuất thông tin có ý nghĩa từ dữ liệu hình ảnh.</w:t>
       </w:r>
     </w:p>
     <w:p>
@@ -3272,13 +3184,7 @@
         <w:jc w:val="both"/>
       </w:pPr>
       <w:r>
-        <w:t>Sự phát triển của mạng nơ-ron tích chập (CNN – Convolutional Neural Network) từ năm 2012 trở đi đã tạo ra bướ</w:t>
-      </w:r>
-      <w:r>
-        <w:t>c đột phá lớn trong thị giác máy tính. CNN có khả năng tự học các đặc trưng trực quan từ dữ liệu huấn luyện mà không cần thiết kế đặc trưng thủ công, giúp độ chính xác trong các bài toán phân loại ảnh, phát hiện đối tượng và nhận diện khuôn mặt tăng vượt b</w:t>
-      </w:r>
-      <w:r>
-        <w:t>ậc.</w:t>
+        <w:t>Sự phát triển của mạng nơ-ron tích chập (CNN – Convolutional Neural Network) từ năm 2012 trở đi đã tạo ra bước đột phá lớn trong thị giác máy tính. CNN có khả năng tự học các đặc trưng trực quan từ dữ liệu huấn luyện mà không cần thiết kế đặc trưng thủ công, giúp độ chính xác trong các bài toán phân loại ảnh, phát hiện đối tượng và nhận diện khuôn mặt tăng vượt bậc.</w:t>
       </w:r>
     </w:p>
     <w:p>
@@ -3288,10 +3194,7 @@
         <w:jc w:val="both"/>
       </w:pPr>
       <w:r>
-        <w:t>Trong hệ thống MTUFace, thị giác máy tính được ứng dụng vào hai bài toán cốt lõi: (1) Phát hiện và nhận diện khuôn mặt để xác thực danh tính sinh viên, và (2) Phát hiện giả mạo (Liveness Detection) để đảm bảo người đứng trước camera là người thật, khôn</w:t>
-      </w:r>
-      <w:r>
-        <w:t>g phải ảnh in hoặc video phát lại.</w:t>
+        <w:t>Trong hệ thống MTUFace, thị giác máy tính được ứng dụng vào hai bài toán cốt lõi: (1) Phát hiện và nhận diện khuôn mặt để xác thực danh tính sinh viên, và (2) Phát hiện giả mạo (Liveness Detection) để đảm bảo người đứng trước camera là người thật, không phải ảnh in hoặc video phát lại.</w:t>
       </w:r>
     </w:p>
     <w:p>
@@ -3309,10 +3212,7 @@
         <w:jc w:val="both"/>
       </w:pPr>
       <w:r>
-        <w:t>Nhận diện khuôn mặt (Face Recognition) là quá trình xác định danh tính của một người thông qua phân tích hình ảnh khuôn mặt. Quá trình này thường bao gồm ba giai đoạn chính: phát hiện khu</w:t>
-      </w:r>
-      <w:r>
-        <w:t>ôn mặt, trích xuất đặc trưng và so khớp danh tính.</w:t>
+        <w:t>Nhận diện khuôn mặt (Face Recognition) là quá trình xác định danh tính của một người thông qua phân tích hình ảnh khuôn mặt. Quá trình này thường bao gồm ba giai đoạn chính: phát hiện khuôn mặt, trích xuất đặc trưng và so khớp danh tính.</w:t>
       </w:r>
     </w:p>
     <w:p>
@@ -3343,13 +3243,7 @@
         <w:spacing w:before="80" w:after="80"/>
       </w:pPr>
       <w:r>
-        <w:t>SCRFD (Sample and Computation Redistribu</w:t>
-      </w:r>
-      <w:r>
-        <w:t>tion for Efficient Face Detection): Được tích hợp trong thư viện InsightFace, SCRFD là thuật toán phát hiện khuôn mặt hiện đại với tốc độ cao và độ chính xác tốt, tối ưu hóa cho triển khai thời gian thực. SCRFD cân bằng hiệu quả giữa tốc độ xử lý và chất l</w:t>
-      </w:r>
-      <w:r>
-        <w:t>ượng phát hiện thông qua kỹ thuật phân phối lại mẫu và tính toán.</w:t>
+        <w:t>SCRFD (Sample and Computation Redistribution for Efficient Face Detection): Được tích hợp trong thư viện InsightFace, SCRFD là thuật toán phát hiện khuôn mặt hiện đại với tốc độ cao và độ chính xác tốt, tối ưu hóa cho triển khai thời gian thực. SCRFD cân bằng hiệu quả giữa tốc độ xử lý và chất lượng phát hiện thông qua kỹ thuật phân phối lại mẫu và tính toán.</w:t>
       </w:r>
     </w:p>
     <w:p>
@@ -3362,10 +3256,7 @@
         <w:spacing w:before="80" w:after="80"/>
       </w:pPr>
       <w:r>
-        <w:t>YOLO (You Only Look Once): Thuật toán phát hiện đối tượng một lần duyệt (single-pass) của Redmon và cộng sự (2016), được cấu hình lại để phát hiện khuôn mặt với độ trễ thấp. YOLO chia ảnh th</w:t>
-      </w:r>
-      <w:r>
-        <w:t>ành lưới ô (grid cells) và dự đoán đồng thời bounding box và xác suất lớp cho tất cả các ô trong một lần chuyền tiếp (forward pass).</w:t>
+        <w:t>YOLO (You Only Look Once): Thuật toán phát hiện đối tượng một lần duyệt (single-pass) của Redmon và cộng sự (2016), được cấu hình lại để phát hiện khuôn mặt với độ trễ thấp. YOLO chia ảnh thành lưới ô (grid cells) và dự đoán đồng thời bounding box và xác suất lớp cho tất cả các ô trong một lần chuyền tiếp (forward pass).</w:t>
       </w:r>
     </w:p>
     <w:p>
@@ -3383,10 +3274,7 @@
         <w:jc w:val="both"/>
       </w:pPr>
       <w:r>
-        <w:t>Sau khi phát hiện và cắt vùng khuôn mặt, bước tiếp theo là trích xuất vect</w:t>
-      </w:r>
-      <w:r>
-        <w:t>or đặc trưng (embedding) đại diện cho danh tính của khuôn mặt đó. Hệ thống MTUFace hỗ trợ hai phương pháp trích xuất đặc trưng:</w:t>
+        <w:t>Sau khi phát hiện và cắt vùng khuôn mặt, bước tiếp theo là trích xuất vector đặc trưng (embedding) đại diện cho danh tính của khuôn mặt đó. Hệ thống MTUFace hỗ trợ hai phương pháp trích xuất đặc trưng:</w:t>
       </w:r>
     </w:p>
     <w:p>
@@ -3399,17 +3287,11 @@
         <w:spacing w:before="80" w:after="80"/>
       </w:pPr>
       <w:r>
-        <w:t>ArcFace (Additive Angular Margin Loss): Được giới thiệu bởi Deng và cộng sự tại CVPR 2019, ArcFace sử dụng hàm mất mát margin gó</w:t>
-      </w:r>
-      <w:r>
-        <w:t xml:space="preserve">c cộng (additive angular margin </w:t>
+        <w:t xml:space="preserve">ArcFace (Additive Angular Margin Loss): Được giới thiệu bởi Deng và cộng sự tại CVPR 2019, ArcFace sử dụng hàm mất mát margin góc cộng (additive angular margin </w:t>
       </w:r>
       <w:r>
         <w:lastRenderedPageBreak/>
-        <w:t>loss) để tối đa hóa sự phân biệt giữa các lớp khuôn mặt khác nhau trong không gian đặc trưng. ArcFace tạo ra vector 512 chiều có tính phân biệt cao, đạt độ chính xác vượt trội trên các tập benchmark như LFW (99.83%) và MegaF</w:t>
-      </w:r>
-      <w:r>
-        <w:t>ace. ArcFace được tích hợp trong InsightFace với mô hình buffalo_l.</w:t>
+        <w:t>loss) để tối đa hóa sự phân biệt giữa các lớp khuôn mặt khác nhau trong không gian đặc trưng. ArcFace tạo ra vector 512 chiều có tính phân biệt cao, đạt độ chính xác vượt trội trên các tập benchmark như LFW (99.83%) và MegaFace. ArcFace được tích hợp trong InsightFace với mô hình buffalo_l.</w:t>
       </w:r>
     </w:p>
     <w:p>
@@ -3422,10 +3304,7 @@
         <w:spacing w:before="80" w:after="80"/>
       </w:pPr>
       <w:r>
-        <w:t>ResNet50: Kiến trúc mạng nơ-ron dư (Residual Network) 50 lớp của He và cộng sự (CVPR 2016). Kỹ thuật kết nối dư (skip connection/residual connection) cho phép gradient lan truyền ngược xuy</w:t>
-      </w:r>
-      <w:r>
-        <w:t>ên suốt mạng sâu mà không bị mất mát, giải quyết vấn đề vanishing gradient. ResNet50 trong MTUFace được sử dụng kết hợp với YOLO để tạo thành pipeline nhận diện thay thế.</w:t>
+        <w:t>ResNet50: Kiến trúc mạng nơ-ron dư (Residual Network) 50 lớp của He và cộng sự (CVPR 2016). Kỹ thuật kết nối dư (skip connection/residual connection) cho phép gradient lan truyền ngược xuyên suốt mạng sâu mà không bị mất mát, giải quyết vấn đề vanishing gradient. ResNet50 trong MTUFace được sử dụng kết hợp với YOLO để tạo thành pipeline nhận diện thay thế.</w:t>
       </w:r>
     </w:p>
     <w:p>
@@ -3443,10 +3322,7 @@
         <w:jc w:val="both"/>
       </w:pPr>
       <w:r>
-        <w:t>So khớp khuôn mặt là bước cuối cùng, so sánh</w:t>
-      </w:r>
-      <w:r>
-        <w:t xml:space="preserve"> vector đặc trưng của khuôn mặt vừa trích xuất với cơ sở dữ liệu vector đã đăng ký để xác định danh tính. MTUFace sử dụng độ đo Cosine Similarity (độ tương đồng cosine):</w:t>
+        <w:t>So khớp khuôn mặt là bước cuối cùng, so sánh vector đặc trưng của khuôn mặt vừa trích xuất với cơ sở dữ liệu vector đã đăng ký để xác định danh tính. MTUFace sử dụng độ đo Cosine Similarity (độ tương đồng cosine):</w:t>
       </w:r>
     </w:p>
     <w:p>
@@ -3469,13 +3345,7 @@
         <w:jc w:val="both"/>
       </w:pPr>
       <w:r>
-        <w:t xml:space="preserve">Giá trị similarity dao động từ -1 </w:t>
-      </w:r>
-      <w:r>
-        <w:t>đến 1, trong đó 1 là hoàn toàn giống nhau. Ngưỡng nhận diện (threshold) được cấu hình tại 0.5 cho ArcFace và 0.6 cho ResNet50 dựa trên kết quả thực nghiệm. Khi similarity vượt ngưỡng và vượt qua bước Liveness Detection, hệ thống ghi nhận điểm danh thành cô</w:t>
-      </w:r>
-      <w:r>
-        <w:t>ng.</w:t>
+        <w:t>Giá trị similarity dao động từ -1 đến 1, trong đó 1 là hoàn toàn giống nhau. Ngưỡng nhận diện (threshold) được cấu hình tại 0.5 cho ArcFace và 0.6 cho ResNet50 dựa trên kết quả thực nghiệm. Khi similarity vượt ngưỡng và vượt qua bước Liveness Detection, hệ thống ghi nhận điểm danh thành công.</w:t>
       </w:r>
     </w:p>
     <w:p>
@@ -3493,10 +3363,7 @@
         <w:jc w:val="both"/>
       </w:pPr>
       <w:r>
-        <w:t>Liveness Detection là công nghệ phân biệt người thật (live person) với các hình thức tấn công giả mạo (spoofing attacks) như in ảnh (print attack), phát lại video qua màn hình (replay attack) hoặc mặt nạ</w:t>
-      </w:r>
-      <w:r>
-        <w:t xml:space="preserve"> 3D. Đây là thành phần bảo mật cốt lõi của MTUFace, đảm bảo chỉ sinh viên đứng trực tiếp trước camera mới được điểm danh.</w:t>
+        <w:t>Liveness Detection là công nghệ phân biệt người thật (live person) với các hình thức tấn công giả mạo (spoofing attacks) như in ảnh (print attack), phát lại video qua màn hình (replay attack) hoặc mặt nạ 3D. Đây là thành phần bảo mật cốt lõi của MTUFace, đảm bảo chỉ sinh viên đứng trực tiếp trước camera mới được điểm danh.</w:t>
       </w:r>
     </w:p>
     <w:p>
@@ -3519,13 +3386,7 @@
         <w:spacing w:before="80" w:after="80"/>
       </w:pPr>
       <w:r>
-        <w:t>Phân tích kết cấu (Texture Analysis): Sử dụ</w:t>
-      </w:r>
-      <w:r>
-        <w:t>ng LBP (Local Binary Pattern) và phân tích tần số (Frequency Analysis) để phát hiện sự khác biệt về kết cấu bề mặt giữa da người thật và giấy in hoặc màn hình điện tử. Da người có cấu trúc 3D và độ sâu tự nhiên khác biệt hoàn toàn so với bề mặt phẳng của ả</w:t>
-      </w:r>
-      <w:r>
-        <w:t>nh in.</w:t>
+        <w:t>Phân tích kết cấu (Texture Analysis): Sử dụng LBP (Local Binary Pattern) và phân tích tần số (Frequency Analysis) để phát hiện sự khác biệt về kết cấu bề mặt giữa da người thật và giấy in hoặc màn hình điện tử. Da người có cấu trúc 3D và độ sâu tự nhiên khác biệt hoàn toàn so với bề mặt phẳng của ảnh in.</w:t>
       </w:r>
     </w:p>
     <w:p>
@@ -3567,10 +3428,7 @@
         <w:pStyle w:val="u3"/>
       </w:pPr>
       <w:r>
-        <w:t>1.4.1. Ngôn ngữ Python và hệ sinh thái th</w:t>
-      </w:r>
-      <w:r>
-        <w:t>ư viện AI</w:t>
+        <w:t>1.4.1. Ngôn ngữ Python và hệ sinh thái thư viện AI</w:t>
       </w:r>
     </w:p>
     <w:p>
@@ -3593,10 +3451,7 @@
         <w:spacing w:before="80" w:after="80"/>
       </w:pPr>
       <w:r>
-        <w:t>OpenCV (Open-Source Computer Vision Library): Thư viện mã nguồ</w:t>
-      </w:r>
-      <w:r>
-        <w:t>n mở xử lý ảnh và video hàng đầu, cung cấp các hàm đọc/ghi video, chuyển đổi không gian màu, biến đổi hình học và nhiều thuật toán xử lý ảnh cổ điển.</w:t>
+        <w:t>OpenCV (Open-Source Computer Vision Library): Thư viện mã nguồn mở xử lý ảnh và video hàng đầu, cung cấp các hàm đọc/ghi video, chuyển đổi không gian màu, biến đổi hình học và nhiều thuật toán xử lý ảnh cổ điển.</w:t>
       </w:r>
     </w:p>
     <w:p>
@@ -3610,10 +3465,7 @@
       </w:pPr>
       <w:r>
         <w:lastRenderedPageBreak/>
-        <w:t>NumPy: Thư viện tính toán số học, cung cấp mảng đa chiều hiệu năng cao (ndarray) và các phép toán vector/m</w:t>
-      </w:r>
-      <w:r>
-        <w:t>a trận nền tảng cho tất cả các tác vụ tính toán AI.</w:t>
+        <w:t>NumPy: Thư viện tính toán số học, cung cấp mảng đa chiều hiệu năng cao (ndarray) và các phép toán vector/ma trận nền tảng cho tất cả các tác vụ tính toán AI.</w:t>
       </w:r>
     </w:p>
     <w:p>
@@ -3639,10 +3491,7 @@
         <w:spacing w:before="80" w:after="80"/>
       </w:pPr>
       <w:r>
-        <w:t>Ultralytics YOLO: Framework triển khai YOLO thế hệ</w:t>
-      </w:r>
-      <w:r>
-        <w:t xml:space="preserve"> mới nhất với API đơn giản, hỗ trợ training, validation và inference tiện lợi.</w:t>
+        <w:t>Ultralytics YOLO: Framework triển khai YOLO thế hệ mới nhất với API đơn giản, hỗ trợ training, validation và inference tiện lợi.</w:t>
       </w:r>
     </w:p>
     <w:p>
@@ -3655,10 +3504,7 @@
         <w:spacing w:before="80" w:after="80"/>
       </w:pPr>
       <w:r>
-        <w:t>Flask và Flask-SocketIO: Framework web nhẹ cho Python, phù hợp tích hợp với pipeline AI. Flask-SocketIO bổ sung giao thức WebSocket cho phép cập nhật kết quả điểm danh thời gian</w:t>
-      </w:r>
-      <w:r>
-        <w:t xml:space="preserve"> thực lên màn hình Kiosk HUD.</w:t>
+        <w:t>Flask và Flask-SocketIO: Framework web nhẹ cho Python, phù hợp tích hợp với pipeline AI. Flask-SocketIO bổ sung giao thức WebSocket cho phép cập nhật kết quả điểm danh thời gian thực lên màn hình Kiosk HUD.</w:t>
       </w:r>
     </w:p>
     <w:p>
@@ -3689,10 +3535,7 @@
         <w:jc w:val="both"/>
       </w:pPr>
       <w:r>
-        <w:t>Flutter là framework phát triển ứng dụng đa n</w:t>
-      </w:r>
-      <w:r>
-        <w:t>ền tảng (cross-platform) của Google, cho phép xây dựng ứng dụng native trên iOS, Android, Web và Desktop từ một codebase duy nhất bằng ngôn ngữ Dart. Flutter sử dụng engine Skia để render giao diện, đảm bảo hiệu năng 60fps mượt mà trên mọi nền tảng.</w:t>
+        <w:t>Flutter là framework phát triển ứng dụng đa nền tảng (cross-platform) của Google, cho phép xây dựng ứng dụng native trên iOS, Android, Web và Desktop từ một codebase duy nhất bằng ngôn ngữ Dart. Flutter sử dụng engine Skia để render giao diện, đảm bảo hiệu năng 60fps mượt mà trên mọi nền tảng.</w:t>
       </w:r>
     </w:p>
     <w:p>
@@ -3702,13 +3545,7 @@
         <w:jc w:val="both"/>
       </w:pPr>
       <w:r>
-        <w:t xml:space="preserve">Lý do </w:t>
-      </w:r>
-      <w:r>
-        <w:t xml:space="preserve">chọn Flutter cho ứng dụng sinh viên MTUFace: khả năng phát triển đồng thời iOS và Android từ một codebase tiết kiệm chi phí và thời gian; widget system phong phú cho phép xây dựng giao diện đẹp, nhất quán; hỗ trợ SQLite (Sqflite) cho lưu trữ offline; cộng </w:t>
-      </w:r>
-      <w:r>
-        <w:t>đồng và hệ sinh thái package (pub.dev) đa dạng.</w:t>
+        <w:t>Lý do chọn Flutter cho ứng dụng sinh viên MTUFace: khả năng phát triển đồng thời iOS và Android từ một codebase tiết kiệm chi phí và thời gian; widget system phong phú cho phép xây dựng giao diện đẹp, nhất quán; hỗ trợ SQLite (Sqflite) cho lưu trữ offline; cộng đồng và hệ sinh thái package (pub.dev) đa dạng.</w:t>
       </w:r>
     </w:p>
     <w:p>
@@ -3739,10 +3576,7 @@
         <w:spacing w:before="80" w:after="80"/>
       </w:pPr>
       <w:r>
-        <w:t xml:space="preserve">MySQL (Relational Database): Lưu </w:t>
-      </w:r>
-      <w:r>
-        <w:t>trữ dữ liệu có cấu trúc – thông tin sinh viên, lịch học, kết quả điểm danh, cảnh báo gian lận. MySQL đảm bảo tính toàn vẹn dữ liệu (ACID) và hỗ trợ truy vấn phức tạp với JOIN nhiều bảng.</w:t>
+        <w:t>MySQL (Relational Database): Lưu trữ dữ liệu có cấu trúc – thông tin sinh viên, lịch học, kết quả điểm danh, cảnh báo gian lận. MySQL đảm bảo tính toàn vẹn dữ liệu (ACID) và hỗ trợ truy vấn phức tạp với JOIN nhiều bảng.</w:t>
       </w:r>
     </w:p>
     <w:p>
@@ -3755,10 +3589,7 @@
         <w:spacing w:before="80" w:after="80"/>
       </w:pPr>
       <w:r>
-        <w:t>SQLite (Local Database trên Mobile): Cơ sở dữ liệu nhúng trên thiết b</w:t>
-      </w:r>
-      <w:r>
-        <w:t>ị di động, cho phép ứng dụng Flutter hoạt động offline, lưu trữ lịch học và thông tin sinh viên cục bộ, đồng bộ với server khi có kết nối mạng.</w:t>
+        <w:t>SQLite (Local Database trên Mobile): Cơ sở dữ liệu nhúng trên thiết bị di động, cho phép ứng dụng Flutter hoạt động offline, lưu trữ lịch học và thông tin sinh viên cục bộ, đồng bộ với server khi có kết nối mạng.</w:t>
       </w:r>
     </w:p>
     <w:p>
@@ -3771,10 +3602,7 @@
         <w:spacing w:before="80" w:after="80"/>
       </w:pPr>
       <w:r>
-        <w:t>ChromaDB (Vector Database): Lưu trữ vector embedding của các câu hỏi FAQ và tài liệu kiến thức hệ thống, phục vụ</w:t>
-      </w:r>
-      <w:r>
-        <w:t xml:space="preserve"> bước retrieval (truy xuất ngữ nghĩa) trong kiến trúc RAG của AI Chatbot.</w:t>
+        <w:t>ChromaDB (Vector Database): Lưu trữ vector embedding của các câu hỏi FAQ và tài liệu kiến thức hệ thống, phục vụ bước retrieval (truy xuất ngữ nghĩa) trong kiến trúc RAG của AI Chatbot.</w:t>
       </w:r>
     </w:p>
     <w:p>
@@ -3806,10 +3634,7 @@
         <w:jc w:val="both"/>
       </w:pPr>
       <w:r>
-        <w:t>MTUFace được thiết kế theo kiến trúc phân tầng Client-Server hiện đại, với ba thành phần cốt lõi độc lập giao tiếp qua RESTful API và WebSocket: (1) Web Admin Dashboard &amp; Kiosk HUD – giao diện quản trị cho giảng viên và nhà trường; (2) Mobile App Flutter –</w:t>
-      </w:r>
-      <w:r>
-        <w:t xml:space="preserve"> ứng dụng sinh viên đa nền tảng; và (3) AI Engine – bộ xử lý trí tuệ nhân tạo trung tâm.</w:t>
+        <w:t>MTUFace được thiết kế theo kiến trúc phân tầng Client-Server hiện đại, với ba thành phần cốt lõi độc lập giao tiếp qua RESTful API và WebSocket: (1) Web Admin Dashboard &amp; Kiosk HUD – giao diện quản trị cho giảng viên và nhà trường; (2) Mobile App Flutter – ứng dụng sinh viên đa nền tảng; và (3) AI Engine – bộ xử lý trí tuệ nhân tạo trung tâm.</w:t>
       </w:r>
     </w:p>
     <w:p>
@@ -3827,10 +3652,7 @@
         <w:jc w:val="both"/>
       </w:pPr>
       <w:r>
-        <w:t xml:space="preserve">Backend Flask đóng vai trò là API Gateway trung tâm, tiếp nhận yêu cầu từ cả Web Client, Mobile App và Kiosk. Luồng xử lý điểm danh </w:t>
-      </w:r>
-      <w:r>
-        <w:t>diễn ra như sau:</w:t>
+        <w:t>Backend Flask đóng vai trò là API Gateway trung tâm, tiếp nhận yêu cầu từ cả Web Client, Mobile App và Kiosk. Luồng xử lý điểm danh diễn ra như sau:</w:t>
       </w:r>
     </w:p>
     <w:p>
@@ -3903,10 +3725,7 @@
         <w:pStyle w:val="u3"/>
       </w:pPr>
       <w:r>
-        <w:t>2.1.2. Giải pháp ứng dụng Mobile O</w:t>
-      </w:r>
-      <w:r>
-        <w:t>ffline-First</w:t>
+        <w:t>2.1.2. Giải pháp ứng dụng Mobile Offline-First</w:t>
       </w:r>
     </w:p>
     <w:p>
@@ -3916,10 +3735,7 @@
         <w:jc w:val="both"/>
       </w:pPr>
       <w:r>
-        <w:t>Ứng dụng Flutter được thiết kế theo mô hình Offline-First: tất cả dữ liệu thiết yếu (lịch học, thông tin cá nhân, lịch sử điểm danh) được đồng bộ về SQLite cục bộ trên thiết bị. Khi không có mạng, ứng dụng vẫn hoạt động đầy đủ từ dữ liệu cục b</w:t>
-      </w:r>
-      <w:r>
-        <w:t>ộ. Khi kết nối mạng khôi phục, ứng dụng tự động đồng bộ các thay đổi với server theo chiều server-to-client (pull sync) và client-to-server (push sync) cho các tác vụ yêu cầu xác thực.</w:t>
+        <w:t>Ứng dụng Flutter được thiết kế theo mô hình Offline-First: tất cả dữ liệu thiết yếu (lịch học, thông tin cá nhân, lịch sử điểm danh) được đồng bộ về SQLite cục bộ trên thiết bị. Khi không có mạng, ứng dụng vẫn hoạt động đầy đủ từ dữ liệu cục bộ. Khi kết nối mạng khôi phục, ứng dụng tự động đồng bộ các thay đổi với server theo chiều server-to-client (pull sync) và client-to-server (push sync) cho các tác vụ yêu cầu xác thực.</w:t>
       </w:r>
     </w:p>
     <w:p>
@@ -3935,10 +3751,7 @@
         <w:pStyle w:val="u3"/>
       </w:pPr>
       <w:r>
-        <w:t>2.2.1. Tiền xử lý dữ liệu và c</w:t>
-      </w:r>
-      <w:r>
-        <w:t>ăn chỉnh khuôn mặt</w:t>
+        <w:t>2.2.1. Tiền xử lý dữ liệu và căn chỉnh khuôn mặt</w:t>
       </w:r>
     </w:p>
     <w:p>
@@ -3961,10 +3774,7 @@
         <w:spacing w:before="80" w:after="80"/>
       </w:pPr>
       <w:r>
-        <w:t>Phát hiện và cắt vùng khuôn mặt (Face Crop): Sử dụng bounding box từ detector (SCRFD hoặc YOLO) với padding 20% để bao g</w:t>
-      </w:r>
-      <w:r>
-        <w:t>ồm vùng xung quanh khuôn mặt.</w:t>
+        <w:t>Phát hiện và cắt vùng khuôn mặt (Face Crop): Sử dụng bounding box từ detector (SCRFD hoặc YOLO) với padding 20% để bao gồm vùng xung quanh khuôn mặt.</w:t>
       </w:r>
     </w:p>
     <w:p>
@@ -3990,10 +3800,7 @@
         <w:spacing w:before="80" w:after="80"/>
       </w:pPr>
       <w:r>
-        <w:t>Chuẩn hóa kích thước: Resize về 112×112 p</w:t>
-      </w:r>
-      <w:r>
-        <w:t>ixel (chuẩn đầu vào InsightFace/ArcFace).</w:t>
+        <w:t>Chuẩn hóa kích thước: Resize về 112×112 pixel (chuẩn đầu vào InsightFace/ArcFace).</w:t>
       </w:r>
     </w:p>
     <w:p>
@@ -4019,10 +3826,7 @@
         <w:spacing w:before="80" w:after="80"/>
       </w:pPr>
       <w:r>
-        <w:t>Data Augmentation (khi thu thập): Áp dụng các biến đổi ngẫu nhiên (rotation ±15°, brightness ±20%, horizonta</w:t>
-      </w:r>
-      <w:r>
-        <w:t>l flip, Gaussian noise) để tăng tính đa dạng của tập dữ liệu đăng ký.</w:t>
+        <w:t>Data Augmentation (khi thu thập): Áp dụng các biến đổi ngẫu nhiên (rotation ±15°, brightness ±20%, horizontal flip, Gaussian noise) để tăng tính đa dạng của tập dữ liệu đăng ký.</w:t>
       </w:r>
     </w:p>
     <w:p>
@@ -4041,10 +3845,7 @@
       </w:pPr>
       <w:r>
         <w:lastRenderedPageBreak/>
-        <w:t xml:space="preserve">MTUFace sử dụng chiến lược few-shot learning thông qua metric learning thay vì huấn luyện lại mô hình từ đầu. Cụ thể, khi đăng ký khuôn </w:t>
-      </w:r>
-      <w:r>
-        <w:t>mặt sinh viên, hệ thống thu thập 5–10 ảnh đại diện, trích xuất embedding từ mô hình pretrained (ArcFace buffalo_l) và tính trung bình các vector embedding thành một prototype vector đại diện duy nhất lưu vào MySQL.</w:t>
+        <w:t>MTUFace sử dụng chiến lược few-shot learning thông qua metric learning thay vì huấn luyện lại mô hình từ đầu. Cụ thể, khi đăng ký khuôn mặt sinh viên, hệ thống thu thập 5–10 ảnh đại diện, trích xuất embedding từ mô hình pretrained (ArcFace buffalo_l) và tính trung bình các vector embedding thành một prototype vector đại diện duy nhất lưu vào MySQL.</w:t>
       </w:r>
     </w:p>
     <w:p>
@@ -4054,10 +3855,7 @@
         <w:jc w:val="both"/>
       </w:pPr>
       <w:r>
-        <w:t>Toàn bộ prototype vector được load vào bộ</w:t>
-      </w:r>
-      <w:r>
-        <w:t xml:space="preserve"> nhớ RAM khi khởi động server, tổ chức thành numpy array để tính cosine similarity hàng loạt (batch) cho nhiều khuôn mặt cùng lúc, đảm bảo tốc độ xử lý thời gian thực ngay cả với số lượng sinh viên lớn.</w:t>
+        <w:t>Toàn bộ prototype vector được load vào bộ nhớ RAM khi khởi động server, tổ chức thành numpy array để tính cosine similarity hàng loạt (batch) cho nhiều khuôn mặt cùng lúc, đảm bảo tốc độ xử lý thời gian thực ngay cả với số lượng sinh viên lớn.</w:t>
       </w:r>
     </w:p>
     <w:p>
@@ -4075,10 +3873,7 @@
         <w:jc w:val="both"/>
       </w:pPr>
       <w:r>
-        <w:t>Hệ thống</w:t>
-      </w:r>
-      <w:r>
-        <w:t xml:space="preserve"> Liveness Detection của MTUFace hoạt động theo nguyên tắc "fail-safe": một khuôn mặt phải vượt qua TẤT CẢ các kiểm tra liveness mới được xem là hợp lệ. Pipeline liveness:</w:t>
+        <w:t>Hệ thống Liveness Detection của MTUFace hoạt động theo nguyên tắc "fail-safe": một khuôn mặt phải vượt qua TẤT CẢ các kiểm tra liveness mới được xem là hợp lệ. Pipeline liveness:</w:t>
       </w:r>
     </w:p>
     <w:p>
@@ -4091,10 +3886,7 @@
         <w:spacing w:before="80" w:after="80"/>
       </w:pPr>
       <w:r>
-        <w:t>Texture Score: Tính điểm kết cấu qua Laplacian variance (độ sắc nét) và LBP histogram</w:t>
-      </w:r>
-      <w:r>
-        <w:t>. Ảnh in hoặc màn hình thường có điểm kết cấu thấp hơn ngưỡng T1.</w:t>
+        <w:t>Texture Score: Tính điểm kết cấu qua Laplacian variance (độ sắc nét) và LBP histogram. Ảnh in hoặc màn hình thường có điểm kết cấu thấp hơn ngưỡng T1.</w:t>
       </w:r>
     </w:p>
     <w:p>
@@ -4120,10 +3912,7 @@
         <w:spacing w:before="80" w:after="80"/>
       </w:pPr>
       <w:r>
-        <w:t>3D Depth Estimation: Sử dụng landmarks để ước tính độ cong 3</w:t>
-      </w:r>
-      <w:r>
-        <w:t>D của khuôn mặt. Khuôn mặt phẳng (ảnh/video) có độ cong thấp.</w:t>
+        <w:t>3D Depth Estimation: Sử dụng landmarks để ước tính độ cong 3D của khuôn mặt. Khuôn mặt phẳng (ảnh/video) có độ cong thấp.</w:t>
       </w:r>
     </w:p>
     <w:p>
@@ -4144,10 +3933,7 @@
         <w:pStyle w:val="u2"/>
       </w:pPr>
       <w:r>
-        <w:t xml:space="preserve">2.3. Đề xuất Trợ lý ảo </w:t>
-      </w:r>
-      <w:r>
-        <w:t>AI (Chatbot RAG)</w:t>
+        <w:t>2.3. Đề xuất Trợ lý ảo AI (Chatbot RAG)</w:t>
       </w:r>
     </w:p>
     <w:p>
@@ -4165,10 +3951,7 @@
         <w:jc w:val="both"/>
       </w:pPr>
       <w:r>
-        <w:t>RAG (Lewis và cộng sự, NeurIPS 2020) là kiến trúc kết hợp hai giai đoạn: Retrieval (truy xuất) và Generation (sinh văn bản). Thay vì dựa hoàn toàn vào kiến thức được học trong quá trình huấn luyện của LLM, RAG cho phép mô hình truy xuất thông tin liên quan</w:t>
-      </w:r>
-      <w:r>
-        <w:t xml:space="preserve"> từ cơ sở tri thức bên ngoài trước khi sinh câu trả lời, giảm thiểu ảo giác (hallucination) và đảm bảo tính chính xác của câu trả lời.</w:t>
+        <w:t>RAG (Lewis và cộng sự, NeurIPS 2020) là kiến trúc kết hợp hai giai đoạn: Retrieval (truy xuất) và Generation (sinh văn bản). Thay vì dựa hoàn toàn vào kiến thức được học trong quá trình huấn luyện của LLM, RAG cho phép mô hình truy xuất thông tin liên quan từ cơ sở tri thức bên ngoài trước khi sinh câu trả lời, giảm thiểu ảo giác (hallucination) và đảm bảo tính chính xác của câu trả lời.</w:t>
       </w:r>
     </w:p>
     <w:p>
@@ -4191,10 +3974,7 @@
         <w:spacing w:before="80" w:after="80"/>
       </w:pPr>
       <w:r>
-        <w:t>Offline Indexing Pipeline: Chuyển đổi tài liệu kiến thức (FAQ, quy đị</w:t>
-      </w:r>
-      <w:r>
-        <w:t>nh trường, thông tin sinh viên) thành vector embedding bằng sentence-transformer model, lưu vào ChromaDB.</w:t>
+        <w:t>Offline Indexing Pipeline: Chuyển đổi tài liệu kiến thức (FAQ, quy định trường, thông tin sinh viên) thành vector embedding bằng sentence-transformer model, lưu vào ChromaDB.</w:t>
       </w:r>
     </w:p>
     <w:p>
@@ -4220,10 +4000,7 @@
         <w:spacing w:before="80" w:after="80"/>
       </w:pPr>
       <w:r>
-        <w:t>Conte</w:t>
-      </w:r>
-      <w:r>
-        <w:t>xt-Augmented Generation: Ghép các đoạn văn bản truy xuất được vào prompt cùng câu hỏi người dùng, gửi đến LLM để sinh câu trả lời chính xác, có ngữ cảnh.</w:t>
+        <w:t>Context-Augmented Generation: Ghép các đoạn văn bản truy xuất được vào prompt cùng câu hỏi người dùng, gửi đến LLM để sinh câu trả lời chính xác, có ngữ cảnh.</w:t>
       </w:r>
     </w:p>
     <w:p>
@@ -4240,11 +4017,9 @@
         <w:ind w:firstLine="720"/>
         <w:jc w:val="both"/>
       </w:pPr>
-      <w:r>
-        <w:t>Cơ sở dữ liệu MySQL của MTUFace được thiết kế theo chuẩn 3NF (Thi</w:t>
-      </w:r>
-      <w:r>
-        <w:t>rd Normal Form) để tối thiểu hóa dư thừa dữ liệu. Các bảng chính:</w:t>
+      <w:bookmarkStart w:id="0" w:name="_Hlk231418432"/>
+      <w:r>
+        <w:t>Cơ sở dữ liệu MySQL của MTUFace được thiết kế theo chuẩn 3NF (Third Normal Form) để tối thiểu hóa dư thừa dữ liệu. Các bảng chính:</w:t>
       </w:r>
     </w:p>
     <w:tbl>
@@ -4296,6 +4071,8 @@
             <w:pPr>
               <w:jc w:val="center"/>
             </w:pPr>
+            <w:bookmarkStart w:id="1" w:name="_Hlk231418439"/>
+            <w:bookmarkEnd w:id="0"/>
             <w:r>
               <w:rPr>
                 <w:b/>
@@ -4933,46 +4710,52 @@
           </w:p>
         </w:tc>
       </w:tr>
+      <w:bookmarkEnd w:id="1"/>
     </w:tbl>
-    <w:p>
-      <w:r>
-        <w:br w:type="page"/>
-      </w:r>
-    </w:p>
-    <w:p>
-      <w:pPr>
-        <w:pStyle w:val="u1"/>
-      </w:pPr>
-      <w:r>
-        <w:lastRenderedPageBreak/>
-        <w:t>CHƯƠNG 3. THỰC NGHIỆM VÀ ĐÁNH GIÁ KẾT QUẢ</w:t>
-      </w:r>
-    </w:p>
-    <w:p>
-      <w:pPr>
-        <w:pStyle w:val="u2"/>
-      </w:pPr>
-      <w:r>
-        <w:t>3.1. Môi trường và dữ liệu thực nghiệm</w:t>
-      </w:r>
-    </w:p>
-    <w:p>
-      <w:pPr>
-        <w:pStyle w:val="u3"/>
-      </w:pPr>
-      <w:r>
-        <w:t>3.1.1. Cấu hình phần cứng và phần mềm triển kh</w:t>
-      </w:r>
-      <w:r>
-        <w:t>ai</w:t>
-      </w:r>
-    </w:p>
     <w:p>
       <w:pPr>
         <w:spacing w:before="120" w:after="120"/>
         <w:ind w:firstLine="720"/>
         <w:jc w:val="both"/>
       </w:pPr>
+    </w:p>
+    <w:p>
+      <w:r>
+        <w:br w:type="page"/>
+      </w:r>
+    </w:p>
+    <w:p>
+      <w:pPr>
+        <w:pStyle w:val="u1"/>
+      </w:pPr>
+      <w:r>
+        <w:lastRenderedPageBreak/>
+        <w:t>CHƯƠNG 3. THỰC NGHIỆM VÀ ĐÁNH GIÁ KẾT QUẢ</w:t>
+      </w:r>
+    </w:p>
+    <w:p>
+      <w:pPr>
+        <w:pStyle w:val="u2"/>
+      </w:pPr>
+      <w:r>
+        <w:t>3.1. Môi trường và dữ liệu thực nghiệm</w:t>
+      </w:r>
+    </w:p>
+    <w:p>
+      <w:pPr>
+        <w:pStyle w:val="u3"/>
+      </w:pPr>
+      <w:r>
+        <w:t>3.1.1. Cấu hình phần cứng và phần mềm triển khai</w:t>
+      </w:r>
+    </w:p>
+    <w:p>
+      <w:pPr>
+        <w:spacing w:before="120" w:after="120"/>
+        <w:ind w:firstLine="720"/>
+        <w:jc w:val="both"/>
+      </w:pPr>
+      <w:bookmarkStart w:id="2" w:name="_Hlk231418467"/>
       <w:r>
         <w:t>Hệ thống được triển khai và thực nghiệm trên cấu hình sau:</w:t>
       </w:r>
@@ -5025,6 +4808,8 @@
             <w:pPr>
               <w:jc w:val="center"/>
             </w:pPr>
+            <w:bookmarkStart w:id="3" w:name="_Hlk231418473"/>
+            <w:bookmarkEnd w:id="2"/>
             <w:r>
               <w:rPr>
                 <w:b/>
@@ -5448,6 +5233,7 @@
         </w:tc>
       </w:tr>
     </w:tbl>
+    <w:bookmarkEnd w:id="3"/>
     <w:p>
       <w:pPr>
         <w:pStyle w:val="u3"/>
@@ -5462,13 +5248,12 @@
         <w:ind w:firstLine="720"/>
         <w:jc w:val="both"/>
       </w:pPr>
-      <w:r>
-        <w:t>Dữ liệu thực nghiệm được thu thập từ 50 sinh viên tình nguyện tham gia, mỗi sinh viên cung cấp 10 ảnh khuôn mặt trong các điều kiện: ánh sáng tự nhiên ban ngày, ánh sáng đèn phòn</w:t>
-      </w:r>
-      <w:r>
-        <w:t>g học, góc nhìn thẳng và nghiêng nhẹ (±15°), có và không có kính. Tổng cộng 500 ảnh đăng ký và 1.500 ảnh kiểm thử (bao gồm cả ảnh tấn công giả mạo: 300 ảnh in và 200 video replay).</w:t>
-      </w:r>
-    </w:p>
+      <w:bookmarkStart w:id="4" w:name="_Hlk231418483"/>
+      <w:r>
+        <w:t>Dữ liệu thực nghiệm được thu thập từ 50 sinh viên tình nguyện tham gia, mỗi sinh viên cung cấp 10 ảnh khuôn mặt trong các điều kiện: ánh sáng tự nhiên ban ngày, ánh sáng đèn phòng học, góc nhìn thẳng và nghiêng nhẹ (±15°), có và không có kính. Tổng cộng 500 ảnh đăng ký và 1.500 ảnh kiểm thử (bao gồm cả ảnh tấn công giả mạo: 300 ảnh in và 200 video replay).</w:t>
+      </w:r>
+    </w:p>
+    <w:bookmarkEnd w:id="4"/>
     <w:p>
       <w:pPr>
         <w:pStyle w:val="u2"/>
@@ -5482,10 +5267,7 @@
         <w:pStyle w:val="u3"/>
       </w:pPr>
       <w:r>
-        <w:t xml:space="preserve">3.2.1. Đánh giá độ chính </w:t>
-      </w:r>
-      <w:r>
-        <w:t>xác nhận diện</w:t>
+        <w:t>3.2.1. Đánh giá độ chính xác nhận diện</w:t>
       </w:r>
     </w:p>
     <w:p>
@@ -5494,6 +5276,7 @@
         <w:ind w:firstLine="720"/>
         <w:jc w:val="both"/>
       </w:pPr>
+      <w:bookmarkStart w:id="5" w:name="_Hlk231418504"/>
       <w:r>
         <w:t>Hai engine AI được đánh giá theo các chỉ số: TAR (True Acceptance Rate – tỷ lệ chấp nhận đúng), FAR (False Acceptance Rate – tỷ lệ chấp nhận sai) và FRR (False Rejection Rate – tỷ lệ từ chối sai):</w:t>
       </w:r>
@@ -5549,6 +5332,8 @@
             <w:pPr>
               <w:jc w:val="center"/>
             </w:pPr>
+            <w:bookmarkStart w:id="6" w:name="_Hlk231418510"/>
+            <w:bookmarkEnd w:id="5"/>
             <w:r>
               <w:rPr>
                 <w:b/>
@@ -5684,16 +5469,7 @@
                 <w:sz w:val="22"/>
                 <w:szCs w:val="22"/>
               </w:rPr>
-              <w:t>Tốc độ (ms/</w:t>
-            </w:r>
-            <w:r>
-              <w:rPr>
-                <w:b/>
-                <w:bCs/>
-                <w:sz w:val="22"/>
-                <w:szCs w:val="22"/>
-              </w:rPr>
-              <w:t>lượt)</w:t>
+              <w:t>Tốc độ (ms/lượt)</w:t>
             </w:r>
           </w:p>
         </w:tc>
@@ -6101,10 +5877,13 @@
         <w:ind w:firstLine="720"/>
         <w:jc w:val="both"/>
       </w:pPr>
+      <w:bookmarkStart w:id="7" w:name="_Hlk231418517"/>
+      <w:bookmarkEnd w:id="6"/>
       <w:r>
         <w:t>InsightFace đạt độ chính xác cao hơn (TAR 97.8% vs 95.2%) trong khi YOLO+ResNet50 có tốc độ nhanh hơn nhẹ (280ms vs 320ms). Hệ thống cho phép giảng viên chọn engine phù hợp theo nhu cầu.</w:t>
       </w:r>
     </w:p>
+    <w:bookmarkEnd w:id="7"/>
     <w:p>
       <w:pPr>
         <w:pStyle w:val="u3"/>
@@ -6119,17 +5898,16 @@
         <w:ind w:firstLine="720"/>
         <w:jc w:val="both"/>
       </w:pPr>
+      <w:bookmarkStart w:id="8" w:name="_Hlk231418556"/>
       <w:r>
         <w:t xml:space="preserve">Hệ thống đạt tốc độ xử lý trung bình 3.2 lượt/giây trên GPU RTX 3060, tương đương điểm danh cho 192 sinh viên/phút. Trong điều kiện thực tế tại phòng học (30-50 sinh viên), thời </w:t>
       </w:r>
       <w:r>
         <w:lastRenderedPageBreak/>
-        <w:t>gian điểm danh toàn lớp ước tính 35-55 giây khi dùng chế độ Camera Tracking (t</w:t>
-      </w:r>
-      <w:r>
-        <w:t>ự động phát hiện và điểm danh nhiều khuôn mặt cùng lúc).</w:t>
-      </w:r>
-    </w:p>
+        <w:t>gian điểm danh toàn lớp ước tính 35-55 giây khi dùng chế độ Camera Tracking (tự động phát hiện và điểm danh nhiều khuôn mặt cùng lúc).</w:t>
+      </w:r>
+    </w:p>
+    <w:bookmarkEnd w:id="8"/>
     <w:p>
       <w:pPr>
         <w:pStyle w:val="u2"/>
@@ -6152,16 +5930,12 @@
         <w:ind w:firstLine="720"/>
         <w:jc w:val="both"/>
       </w:pPr>
-      <w:r>
-        <w:t>Giao diện Web Admin được thiết kế theo phong cách Glassmorphism với backdrop-filter blur, gradient trong suốt và đổ bóng</w:t>
-      </w:r>
-      <w:r>
-        <w:t xml:space="preserve"> mềm. Dashboard hiển thị thống kê tổng quan (tổng sinh viên, buổi học hôm nay, tỷ lệ điểm danh) dưới dạng card trong suốt với hiệu ứng hover. Màn hình Kiosk HUD hỗ trợ hai chế độ: (1) Self-check – sinh viên tự điểm danh trước camera, và (2) Camera Tracking</w:t>
-      </w:r>
-      <w:r>
-        <w:t xml:space="preserve"> – camera tự động quét và điểm danh tất cả khuôn mặt nhận ra trong khung hình.</w:t>
-      </w:r>
-    </w:p>
+      <w:bookmarkStart w:id="9" w:name="_Hlk231418571"/>
+      <w:r>
+        <w:t>Giao diện Web Admin được thiết kế theo phong cách Glassmorphism với backdrop-filter blur, gradient trong suốt và đổ bóng mềm. Dashboard hiển thị thống kê tổng quan (tổng sinh viên, buổi học hôm nay, tỷ lệ điểm danh) dưới dạng card trong suốt với hiệu ứng hover. Màn hình Kiosk HUD hỗ trợ hai chế độ: (1) Self-check – sinh viên tự điểm danh trước camera, và (2) Camera Tracking – camera tự động quét và điểm danh tất cả khuôn mặt nhận ra trong khung hình.</w:t>
+      </w:r>
+    </w:p>
+    <w:bookmarkEnd w:id="9"/>
     <w:p>
       <w:pPr>
         <w:pStyle w:val="u3"/>
@@ -6176,16 +5950,12 @@
         <w:ind w:firstLine="720"/>
         <w:jc w:val="both"/>
       </w:pPr>
-      <w:r>
-        <w:t>Ứng dụng Flutter triển khai thành công trên cả Android và iOS với giao diện nhất quán. Các tính năng chính đã hoàn thiện: đăng nhập bằng MS</w:t>
-      </w:r>
-      <w:r>
-        <w:t>SV + mật khẩu, xem lịch học tuần (tích hợp SQLite offline), tra cứu lịch sử điểm danh từng môn học, quét mã QR đặc biệt để xác nhận điểm danh ngoại tuyến, nhận thông báo push từ giảng viên và tương tác với AI Chatbot. Cơ chế đồng bộ Offline-first hoạt động</w:t>
-      </w:r>
-      <w:r>
-        <w:t xml:space="preserve"> ổn định, dữ liệu lịch học cập nhật mỗi 6 giờ khi có kết nối.</w:t>
-      </w:r>
-    </w:p>
+      <w:bookmarkStart w:id="10" w:name="_Hlk231418585"/>
+      <w:r>
+        <w:t>Ứng dụng Flutter triển khai thành công trên cả Android và iOS với giao diện nhất quán. Các tính năng chính đã hoàn thiện: đăng nhập bằng MSSV + mật khẩu, xem lịch học tuần (tích hợp SQLite offline), tra cứu lịch sử điểm danh từng môn học, quét mã QR đặc biệt để xác nhận điểm danh ngoại tuyến, nhận thông báo push từ giảng viên và tương tác với AI Chatbot. Cơ chế đồng bộ Offline-first hoạt động ổn định, dữ liệu lịch học cập nhật mỗi 6 giờ khi có kết nối.</w:t>
+      </w:r>
+    </w:p>
+    <w:bookmarkEnd w:id="10"/>
     <w:p>
       <w:pPr>
         <w:pStyle w:val="u3"/>
@@ -6200,9 +5970,11 @@
         <w:ind w:firstLine="720"/>
         <w:jc w:val="both"/>
       </w:pPr>
+      <w:bookmarkStart w:id="11" w:name="_Hlk231418599"/>
       <w:r>
         <w:t>Hệ thống được kiểm thử theo các kịch bản:</w:t>
       </w:r>
+      <w:bookmarkEnd w:id="11"/>
     </w:p>
     <w:tbl>
       <w:tblPr>
@@ -6253,6 +6025,7 @@
             <w:pPr>
               <w:jc w:val="center"/>
             </w:pPr>
+            <w:bookmarkStart w:id="12" w:name="_Hlk231418605"/>
             <w:r>
               <w:rPr>
                 <w:b/>
@@ -6672,14 +6445,7 @@
                 <w:sz w:val="22"/>
                 <w:szCs w:val="22"/>
               </w:rPr>
-              <w:t>Hoạt động khi mất kết nối int</w:t>
-            </w:r>
-            <w:r>
-              <w:rPr>
-                <w:sz w:val="22"/>
-                <w:szCs w:val="22"/>
-              </w:rPr>
-              <w:t>ernet (Mobile App)</w:t>
+              <w:t>Hoạt động khi mất kết nối internet (Mobile App)</w:t>
             </w:r>
           </w:p>
         </w:tc>
@@ -6897,6 +6663,7 @@
         </w:tc>
       </w:tr>
     </w:tbl>
+    <w:bookmarkEnd w:id="12"/>
     <w:p>
       <w:pPr>
         <w:pStyle w:val="u3"/>
@@ -6911,13 +6678,12 @@
         <w:ind w:firstLine="720"/>
         <w:jc w:val="both"/>
       </w:pPr>
-      <w:r>
-        <w:t xml:space="preserve">Sau 3 tuần thực nghiệm thực tế tại 4 lớp học với tổng 127 sinh viên tham gia, hệ thống ghi nhận: tổng 2.340 lượt điểm danh hợp lệ, 28 cảnh báo gian lận được phát hiện và gửi về Telegram (trong đó 25/28 được giảng viên xác nhận là thực sự bất thường), thời </w:t>
-      </w:r>
-      <w:r>
-        <w:t>gian điểm danh trung bình mỗi buổi học giảm từ 7.5 phút (thủ công) xuống 48 giây (tự động), tiết kiệm ~6.5 phút mỗi tiết học.</w:t>
-      </w:r>
-    </w:p>
+      <w:bookmarkStart w:id="13" w:name="_Hlk231418617"/>
+      <w:r>
+        <w:t>Sau 3 tuần thực nghiệm thực tế tại 4 lớp học với tổng 127 sinh viên tham gia, hệ thống ghi nhận: tổng 2.340 lượt điểm danh hợp lệ, 28 cảnh báo gian lận được phát hiện và gửi về Telegram (trong đó 25/28 được giảng viên xác nhận là thực sự bất thường), thời gian điểm danh trung bình mỗi buổi học giảm từ 7.5 phút (thủ công) xuống 48 giây (tự động), tiết kiệm ~6.5 phút mỗi tiết học.</w:t>
+      </w:r>
+    </w:p>
+    <w:bookmarkEnd w:id="13"/>
     <w:p>
       <w:r>
         <w:br w:type="page"/>
@@ -6946,11 +6712,9 @@
         <w:ind w:firstLine="720"/>
         <w:jc w:val="both"/>
       </w:pPr>
-      <w:r>
-        <w:t>Đề tài "MTUFace – Nghiên cứu giải pháp điểm danh tự động bằng thị giác máy tính" đã hoàn thành mục tiêu xây dựng một hệ thống điểm danh tích hợp đa thành phần hoàn chỉnh, ứng dụng thành công các công nghệ AI hiện đại vào bài toán thực tế tại môi trường giá</w:t>
-      </w:r>
-      <w:r>
-        <w:t>o dục đại học.</w:t>
+      <w:bookmarkStart w:id="14" w:name="_Hlk231418649"/>
+      <w:r>
+        <w:t>Đề tài "MTUFace – Nghiên cứu giải pháp điểm danh tự động bằng thị giác máy tính" đã hoàn thành mục tiêu xây dựng một hệ thống điểm danh tích hợp đa thành phần hoàn chỉnh, ứng dụng thành công các công nghệ AI hiện đại vào bài toán thực tế tại môi trường giáo dục đại học.</w:t>
       </w:r>
     </w:p>
     <w:p>
@@ -6960,12 +6724,10 @@
         <w:jc w:val="both"/>
       </w:pPr>
       <w:r>
-        <w:t>Về kỹ thuật, hệ thống đạt TAR 97.8% với InsightFace/ArcFace và 95.2% với YOLO/ResNet50, vượt mục tiêu đề ra (&gt;95%). Hệ thống Liveness Detection đạt tỷ lệ phát hiện tấn công giả mạo trên 94%, hiệu quả ngăn chặn điểm danh hộ. Về triển khai, hệ</w:t>
-      </w:r>
-      <w:r>
-        <w:t xml:space="preserve"> thống hoạt động ổn định trong môi trường thực tế, giảm 87% thời gian điểm danh so với phương pháp thủ công.</w:t>
-      </w:r>
-    </w:p>
+        <w:t>Về kỹ thuật, hệ thống đạt TAR 97.8% với InsightFace/ArcFace và 95.2% với YOLO/ResNet50, vượt mục tiêu đề ra (&gt;95%). Hệ thống Liveness Detection đạt tỷ lệ phát hiện tấn công giả mạo trên 94%, hiệu quả ngăn chặn điểm danh hộ. Về triển khai, hệ thống hoạt động ổn định trong môi trường thực tế, giảm 87% thời gian điểm danh so với phương pháp thủ công.</w:t>
+      </w:r>
+    </w:p>
+    <w:bookmarkEnd w:id="14"/>
     <w:p>
       <w:pPr>
         <w:pStyle w:val="u2"/>
@@ -6983,11 +6745,9 @@
         </w:numPr>
         <w:spacing w:before="80" w:after="80"/>
       </w:pPr>
-      <w:r>
-        <w:t>Tích hợp đa thành phần hoàn chỉnh trong một hệ thống: Web Admin, Mobile App, AI Engine, Kiosk, Chatbot và cảnh báo Telegram</w:t>
-      </w:r>
-      <w:r>
-        <w:t>.</w:t>
+      <w:bookmarkStart w:id="15" w:name="_Hlk231418656"/>
+      <w:r>
+        <w:t>Tích hợp đa thành phần hoàn chỉnh trong một hệ thống: Web Admin, Mobile App, AI Engine, Kiosk, Chatbot và cảnh báo Telegram.</w:t>
       </w:r>
     </w:p>
     <w:p>
@@ -7026,10 +6786,7 @@
         <w:spacing w:before="80" w:after="80"/>
       </w:pPr>
       <w:r>
-        <w:t xml:space="preserve">Ứng dụng </w:t>
-      </w:r>
-      <w:r>
-        <w:t>Flutter hoạt động Offline-first, không phụ thuộc kết nối mạng liên tục – phù hợp với hạ tầng mạng không ổn định tại nhiều cơ sở giáo dục.</w:t>
+        <w:t>Ứng dụng Flutter hoạt động Offline-first, không phụ thuộc kết nối mạng liên tục – phù hợp với hạ tầng mạng không ổn định tại nhiều cơ sở giáo dục.</w:t>
       </w:r>
     </w:p>
     <w:p>
@@ -7045,15 +6802,13 @@
         <w:t>AI Chatbot RAG trả lời chính xác các câu hỏi về thông tin sinh viên và quy định mà không bị ảo giác nhờ ChromaDB.</w:t>
       </w:r>
     </w:p>
+    <w:bookmarkEnd w:id="15"/>
     <w:p>
       <w:pPr>
         <w:pStyle w:val="u2"/>
       </w:pPr>
       <w:r>
-        <w:t>3. H</w:t>
-      </w:r>
-      <w:r>
-        <w:t>ạn chế còn tồn tại</w:t>
+        <w:t>3. Hạn chế còn tồn tại</w:t>
       </w:r>
     </w:p>
     <w:p>
@@ -7065,6 +6820,7 @@
         </w:numPr>
         <w:spacing w:before="80" w:after="80"/>
       </w:pPr>
+      <w:bookmarkStart w:id="16" w:name="_Hlk231418664"/>
       <w:r>
         <w:t>Hiệu năng nhận diện giảm trong điều kiện ánh sáng yếu (&lt;100 lux) hoặc khuôn mặt nghiêng góc lớn (&gt;45°).</w:t>
       </w:r>
@@ -7092,10 +6848,7 @@
         <w:spacing w:before="80" w:after="80"/>
       </w:pPr>
       <w:r>
-        <w:t>Hệ thống chư</w:t>
-      </w:r>
-      <w:r>
-        <w:t>a hỗ trợ nhận diện khi sinh viên đeo khẩu trang hoặc che mặt một phần – một hạn chế thực tế quan trọng.</w:t>
+        <w:t>Hệ thống chưa hỗ trợ nhận diện khi sinh viên đeo khẩu trang hoặc che mặt một phần – một hạn chế thực tế quan trọng.</w:t>
       </w:r>
     </w:p>
     <w:p>
@@ -7121,12 +6874,10 @@
         <w:spacing w:before="80" w:after="80"/>
       </w:pPr>
       <w:r>
-        <w:t>Ứng dụng mobile chưa</w:t>
-      </w:r>
-      <w:r>
-        <w:t xml:space="preserve"> hỗ trợ tính năng đăng ký khuôn mặt trực tiếp từ điện thoại, hiện chỉ hỗ trợ qua Web Admin.</w:t>
-      </w:r>
-    </w:p>
+        <w:t>Ứng dụng mobile chưa hỗ trợ tính năng đăng ký khuôn mặt trực tiếp từ điện thoại, hiện chỉ hỗ trợ qua Web Admin.</w:t>
+      </w:r>
+    </w:p>
+    <w:bookmarkEnd w:id="16"/>
     <w:p>
       <w:pPr>
         <w:pStyle w:val="u2"/>
@@ -7144,6 +6895,7 @@
         </w:numPr>
         <w:spacing w:before="80" w:after="80"/>
       </w:pPr>
+      <w:bookmarkStart w:id="17" w:name="_Hlk231418674"/>
       <w:r>
         <w:t>Tích hợp model nhận diện khuôn mặt bị che (Masked Face Recognition) để xử lý tình huống sinh viên đeo khẩu trang.</w:t>
       </w:r>
@@ -7157,14 +6909,9 @@
         </w:numPr>
         <w:spacing w:before="80" w:after="80"/>
       </w:pPr>
-      <w:bookmarkStart w:id="0" w:name="_GoBack"/>
-      <w:r>
-        <w:t>Triển khai Edg</w:t>
-      </w:r>
-      <w:r>
-        <w:t>e Computing: Đưa một phần AI Engine xuống Raspberry Pi 5 hoặc Jetson Nano đặt tại phòng học, giảm phụ thuộc vào đường truyền mạng.</w:t>
-      </w:r>
-      <w:bookmarkEnd w:id="0"/>
+      <w:r>
+        <w:t>Triển khai Edge Computing: Đưa một phần AI Engine xuống Raspberry Pi 5 hoặc Jetson Nano đặt tại phòng học, giảm phụ thuộc vào đường truyền mạng.</w:t>
+      </w:r>
     </w:p>
     <w:p>
       <w:pPr>
@@ -7176,10 +6923,7 @@
         <w:spacing w:before="80" w:after="80"/>
       </w:pPr>
       <w:r>
-        <w:t>Mở rộng quy mô: Tích hợp với hệ thống quản lý đào tạo (LMS) của trường và hệ thống điểm học tập để tự động cập nhật điểm chuy</w:t>
-      </w:r>
-      <w:r>
-        <w:t>ên cần.</w:t>
+        <w:t>Mở rộng quy mô: Tích hợp với hệ thống quản lý đào tạo (LMS) của trường và hệ thống điểm học tập để tự động cập nhật điểm chuyên cần.</w:t>
       </w:r>
     </w:p>
     <w:p>
@@ -7206,12 +6950,10 @@
         <w:spacing w:before="80" w:after="80"/>
       </w:pPr>
       <w:r>
-        <w:t>Phát triển thêm tính năng phân tích cảm xúc (Emotion Recognition) trong lớp học để hỗ trợ giảng vi</w:t>
-      </w:r>
-      <w:r>
-        <w:t>ên đánh giá mức độ tập trung của sinh viên.</w:t>
-      </w:r>
-    </w:p>
+        <w:t>Phát triển thêm tính năng phân tích cảm xúc (Emotion Recognition) trong lớp học để hỗ trợ giảng viên đánh giá mức độ tập trung của sinh viên.</w:t>
+      </w:r>
+    </w:p>
+    <w:bookmarkEnd w:id="17"/>
     <w:p>
       <w:pPr>
         <w:pStyle w:val="u2"/>
@@ -7226,16 +6968,12 @@
         <w:ind w:firstLine="720"/>
         <w:jc w:val="both"/>
       </w:pPr>
-      <w:r>
-        <w:t>Để triển khai rộng rãi hệ thống MTUFace tại Trường Đại học Xây dựng Miền Tây, nhóm tác giả đề xuất một số kiến nghị: (1) Đầu tư camera chuyên dụng cho từng phòng học với khả năng hoạt động trong điều</w:t>
-      </w:r>
-      <w:r>
-        <w:t xml:space="preserve"> kiện thiếu sáng; (2) Xây dựng quy trình thu thập và cập nhật dữ liệu khuôn mặt định kỳ (đầu mỗi học kỳ) để đảm bảo độ chính xác; (3) Ban hành quy định pháp lý nội bộ về thu thập và xử lý dữ liệu sinh trắc học sinh viên theo đúng quy định pháp luật; (4) Đà</w:t>
-      </w:r>
-      <w:r>
-        <w:t>o tạo giảng viên và cán bộ IT về vận hành và bảo trì hệ thống.</w:t>
-      </w:r>
-    </w:p>
+      <w:bookmarkStart w:id="18" w:name="_Hlk231418687"/>
+      <w:r>
+        <w:t>Để triển khai rộng rãi hệ thống MTUFace tại Trường Đại học Xây dựng Miền Tây, nhóm tác giả đề xuất một số kiến nghị: (1) Đầu tư camera chuyên dụng cho từng phòng học với khả năng hoạt động trong điều kiện thiếu sáng; (2) Xây dựng quy trình thu thập và cập nhật dữ liệu khuôn mặt định kỳ (đầu mỗi học kỳ) để đảm bảo độ chính xác; (3) Ban hành quy định pháp lý nội bộ về thu thập và xử lý dữ liệu sinh trắc học sinh viên theo đúng quy định pháp luật; (4) Đào tạo giảng viên và cán bộ IT về vận hành và bảo trì hệ thống.</w:t>
+      </w:r>
+    </w:p>
+    <w:bookmarkEnd w:id="18"/>
     <w:p>
       <w:r>
         <w:br w:type="page"/>
@@ -7255,6 +6993,8 @@
         <w:spacing w:before="100" w:after="100"/>
         <w:ind w:left="720" w:hanging="720"/>
       </w:pPr>
+      <w:bookmarkStart w:id="19" w:name="_Hlk231418718"/>
+      <w:bookmarkStart w:id="20" w:name="_GoBack"/>
       <w:r>
         <w:rPr>
           <w:sz w:val="22"/>
@@ -7268,14 +7008,7 @@
           <w:szCs w:val="22"/>
         </w:rPr>
         <w:tab/>
-        <w:t>Deng, J., Guo, J., Xue, N., &amp; Zafeiriou, S. (2019). ArcFace: Additive Angular Margin Loss for Deep Face Recognition. Proceedings of the IEEE/CVF Conference on Computer Vision and Pattern Recognition (CVPR), pp. 4690–4699. https://arxiv.org/abs/1801.076</w:t>
-      </w:r>
-      <w:r>
-        <w:rPr>
-          <w:sz w:val="22"/>
-          <w:szCs w:val="22"/>
-        </w:rPr>
-        <w:t>98</w:t>
+        <w:t>Deng, J., Guo, J., Xue, N., &amp; Zafeiriou, S. (2019). ArcFace: Additive Angular Margin Loss for Deep Face Recognition. Proceedings of the IEEE/CVF Conference on Computer Vision and Pattern Recognition (CVPR), pp. 4690–4699. https://arxiv.org/abs/1801.07698</w:t>
       </w:r>
     </w:p>
     <w:p>
@@ -7317,14 +7050,7 @@
           <w:szCs w:val="22"/>
         </w:rPr>
         <w:tab/>
-        <w:t xml:space="preserve">Redmon, J., Divvala, </w:t>
-      </w:r>
-      <w:r>
-        <w:rPr>
-          <w:sz w:val="22"/>
-          <w:szCs w:val="22"/>
-        </w:rPr>
-        <w:t>S., Girshick, R., &amp; Farhadi, A. (2016). You Only Look Once: Unified, Real-Time Object Detection. Proceedings of the IEEE Conference on Computer Vision and Pattern Recognition (CVPR). https://arxiv.org/abs/1506.02640</w:t>
+        <w:t>Redmon, J., Divvala, S., Girshick, R., &amp; Farhadi, A. (2016). You Only Look Once: Unified, Real-Time Object Detection. Proceedings of the IEEE Conference on Computer Vision and Pattern Recognition (CVPR). https://arxiv.org/abs/1506.02640</w:t>
       </w:r>
     </w:p>
     <w:p>
@@ -7345,14 +7071,7 @@
           <w:szCs w:val="22"/>
         </w:rPr>
         <w:tab/>
-        <w:t>Lewis, P., et al. (2020). Retrieval-</w:t>
-      </w:r>
-      <w:r>
-        <w:rPr>
-          <w:sz w:val="22"/>
-          <w:szCs w:val="22"/>
-        </w:rPr>
-        <w:t>Augmented Generation for Knowledge-Intensive NLP Tasks. Advances in Neural Information Processing Systems (NeurIPS). https://arxiv.org/abs/2005.11401</w:t>
+        <w:t>Lewis, P., et al. (2020). Retrieval-Augmented Generation for Knowledge-Intensive NLP Tasks. Advances in Neural Information Processing Systems (NeurIPS). https://arxiv.org/abs/2005.11401</w:t>
       </w:r>
     </w:p>
     <w:p>
@@ -7415,14 +7134,7 @@
           <w:szCs w:val="22"/>
         </w:rPr>
         <w:tab/>
-        <w:t>Flutter Team. (2023). Flut</w:t>
-      </w:r>
-      <w:r>
-        <w:rPr>
-          <w:sz w:val="22"/>
-          <w:szCs w:val="22"/>
-        </w:rPr>
-        <w:t>ter Documentation. Google LLC. https://flutter.dev/docs</w:t>
+        <w:t>Flutter Team. (2023). Flutter Documentation. Google LLC. https://flutter.dev/docs</w:t>
       </w:r>
     </w:p>
     <w:p>
@@ -7464,14 +7176,7 @@
           <w:szCs w:val="22"/>
         </w:rPr>
         <w:tab/>
-        <w:t>Flask Development Team. (2023). Flask Documentation. Pallets Projects. https://flask.pallets</w:t>
-      </w:r>
-      <w:r>
-        <w:rPr>
-          <w:sz w:val="22"/>
-          <w:szCs w:val="22"/>
-        </w:rPr>
-        <w:t>projects.com/</w:t>
+        <w:t>Flask Development Team. (2023). Flask Documentation. Pallets Projects. https://flask.palletsprojects.com/</w:t>
       </w:r>
     </w:p>
     <w:p>
@@ -7513,14 +7218,7 @@
           <w:szCs w:val="22"/>
         </w:rPr>
         <w:tab/>
-        <w:t>Duy, N. B., Hai, T. T., Nhan, D. T., &amp; Dinh, T. Q. Ung dung nhan dang guong mat phuc vu giam sat lop hoc truc tuyen. Tap chi Khoa hoc – Dai hoc</w:t>
-      </w:r>
-      <w:r>
-        <w:rPr>
-          <w:sz w:val="22"/>
-          <w:szCs w:val="22"/>
-        </w:rPr>
-        <w:t xml:space="preserve"> Xay dung Mien Tay.</w:t>
+        <w:t>Duy, N. B., Hai, T. T., Nhan, D. T., &amp; Dinh, T. Q. Ung dung nhan dang guong mat phuc vu giam sat lop hoc truc tuyen. Tap chi Khoa hoc – Dai hoc Xay dung Mien Tay.</w:t>
       </w:r>
     </w:p>
     <w:p>
@@ -7583,19 +7281,14 @@
           <w:szCs w:val="22"/>
         </w:rPr>
         <w:tab/>
-        <w:t>AI Vietnam. (2024). Cong nghe nhan dien khuon mat la gi? Cach hoat dong va ung dung.</w:t>
-      </w:r>
-      <w:r>
-        <w:rPr>
-          <w:sz w:val="22"/>
-          <w:szCs w:val="22"/>
-        </w:rPr>
-        <w:t xml:space="preserve"> VNPT AI Blog. https://vnptai.io/vi/blog/detail/cong-nghe-nhan-dien-khuon-mat-la-gi</w:t>
-      </w:r>
+        <w:t>AI Vietnam. (2024). Cong nghe nhan dien khuon mat la gi? Cach hoat dong va ung dung. VNPT AI Blog. https://vnptai.io/vi/blog/detail/cong-nghe-nhan-dien-khuon-mat-la-gi</w:t>
+      </w:r>
+      <w:bookmarkEnd w:id="19"/>
+      <w:bookmarkEnd w:id="20"/>
     </w:p>
     <w:sectPr>
-      <w:headerReference w:type="default" r:id="rId7"/>
-      <w:footerReference w:type="default" r:id="rId8"/>
+      <w:headerReference w:type="default" r:id="rId8"/>
+      <w:footerReference w:type="default" r:id="rId9"/>
       <w:pgSz w:w="11906" w:h="16838"/>
       <w:pgMar w:top="1418" w:right="1134" w:bottom="1134" w:left="1701" w:header="708" w:footer="708" w:gutter="0"/>
       <w:cols w:space="720"/>
@@ -8825,4 +8518,16 @@
     </a:ext>
   </a:extLst>
 </a:theme>
+</file>
+
+<file path=customXml/item1.xml><?xml version="1.0" encoding="utf-8"?>
+<b:Sources xmlns:b="http://schemas.openxmlformats.org/officeDocument/2006/bibliography" xmlns="http://schemas.openxmlformats.org/officeDocument/2006/bibliography" SelectedStyle="\IEEE2006OfficeOnline.xsl" StyleName="IEEE" Version="2006"/>
+</file>
+
+<file path=customXml/itemProps1.xml><?xml version="1.0" encoding="utf-8"?>
+<ds:datastoreItem xmlns:ds="http://schemas.openxmlformats.org/officeDocument/2006/customXml" ds:itemID="{C8CE63E7-BDF9-430D-96BA-B28E060B9C61}">
+  <ds:schemaRefs>
+    <ds:schemaRef ds:uri="http://schemas.openxmlformats.org/officeDocument/2006/bibliography"/>
+  </ds:schemaRefs>
+</ds:datastoreItem>
 </file>
</xml_diff>